<commit_message>
Libros: en la Receta, la letra capital de cada capítulo en blanco
Antes vainilla; así contrasta con la de Pensamiento, negra sobre blanco.

Co-Authored-By: Claude Opus 5.5 <noreply@anthropic.com>
Claude-Session: https://claude.ai/code/session_014ZXCqSPyLGg43e9ivReU3y
</commit_message>
<xml_diff>
--- a/manuscritos/Receta de La Manifestación (edición integral con sitio, revisión 4).docx
+++ b/manuscritos/Receta de La Manifestación (edición integral con sitio, revisión 4).docx
@@ -1282,7 +1282,7 @@
       <w:r>
         <w:rPr>
           <w:rFonts w:ascii="Palatino Linotype" w:hAnsi="Palatino Linotype" w:cs="Palatino Linotype"/>
-          <w:color w:val="E6D8B4"/>
+          <w:color w:val="FFFFFF"/>
           <w:position w:val="-9"/>
           <w:sz w:val="108"/>
           <w:szCs w:val="108"/>
@@ -1791,7 +1791,7 @@
       <w:r>
         <w:rPr>
           <w:rFonts w:ascii="Palatino Linotype" w:hAnsi="Palatino Linotype" w:cs="Palatino Linotype"/>
-          <w:color w:val="E6D8B4"/>
+          <w:color w:val="FFFFFF"/>
           <w:position w:val="-9"/>
           <w:sz w:val="108"/>
           <w:szCs w:val="108"/>
@@ -2955,7 +2955,7 @@
       <w:r>
         <w:rPr>
           <w:rFonts w:ascii="Palatino Linotype" w:hAnsi="Palatino Linotype" w:cs="Palatino Linotype"/>
-          <w:color w:val="E6D8B4"/>
+          <w:color w:val="FFFFFF"/>
           <w:position w:val="-9"/>
           <w:sz w:val="108"/>
           <w:szCs w:val="108"/>
@@ -4301,7 +4301,7 @@
       <w:r>
         <w:rPr>
           <w:rFonts w:ascii="Palatino Linotype" w:hAnsi="Palatino Linotype" w:cs="Palatino Linotype"/>
-          <w:color w:val="E6D8B4"/>
+          <w:color w:val="FFFFFF"/>
           <w:position w:val="-9"/>
           <w:sz w:val="108"/>
           <w:szCs w:val="108"/>
@@ -5212,7 +5212,7 @@
       <w:r>
         <w:rPr>
           <w:rFonts w:ascii="Palatino Linotype" w:hAnsi="Palatino Linotype" w:cs="Palatino Linotype"/>
-          <w:color w:val="E6D8B4"/>
+          <w:color w:val="FFFFFF"/>
           <w:position w:val="-9"/>
           <w:sz w:val="108"/>
           <w:szCs w:val="108"/>
@@ -5764,7 +5764,7 @@
       <w:r>
         <w:rPr>
           <w:rFonts w:ascii="Palatino Linotype" w:hAnsi="Palatino Linotype" w:cs="Palatino Linotype"/>
-          <w:color w:val="E6D8B4"/>
+          <w:color w:val="FFFFFF"/>
           <w:position w:val="-9"/>
           <w:sz w:val="108"/>
           <w:szCs w:val="108"/>

</xml_diff>